<commit_message>
Add case file outbound and notes for DS.3960 and II Kp 459/26
</commit_message>
<xml_diff>
--- a/cases/DS_3960_2025/outbound/stanowisko_dossier_with_authorities.docx
+++ b/cases/DS_3960_2025/outbound/stanowisko_dossier_with_authorities.docx
@@ -86,7 +86,7 @@
           <w:rFonts w:ascii="Times New Roman" w:hAnsi="Times New Roman"/>
           <w:sz w:val="24"/>
         </w:rPr>
-        <w:t>Poznań, dnia 05.08.2026 r.</w:t>
+        <w:t>Poznań, dnia 06.08.2026 r.</w:t>
       </w:r>
     </w:p>
     <w:p>
@@ -1690,7 +1690,79 @@
           <w:rFonts w:ascii="Times New Roman" w:hAnsi="Times New Roman"/>
           <w:sz w:val="24"/>
         </w:rPr>
-        <w:t>1. art. 410 k.p.k.</w:t>
+        <w:t>1. art. 284 § 2 k.k.</w:t>
+      </w:r>
+    </w:p>
+    <w:p>
+      <w:pPr>
+        <w:spacing w:after="0" w:before="0" w:line="240" w:lineRule="auto"/>
+      </w:pPr>
+      <w:r>
+        <w:rPr>
+          <w:rFonts w:ascii="Times New Roman" w:hAnsi="Times New Roman"/>
+          <w:sz w:val="24"/>
+        </w:rPr>
+        <w:t xml:space="preserve">   Przywłaszczenie rzeczy powierzonej. Wymaga m.in. powierzenia z obowiązkiem zwrotu oraz zamiaru bezpośredniego przywłaszczenia.</w:t>
+      </w:r>
+    </w:p>
+    <w:p>
+      <w:pPr>
+        <w:spacing w:after="0" w:before="0" w:line="240" w:lineRule="auto"/>
+      </w:pPr>
+      <w:r>
+        <w:rPr>
+          <w:rFonts w:ascii="Times New Roman" w:hAnsi="Times New Roman"/>
+          <w:sz w:val="24"/>
+        </w:rPr>
+        <w:t>2. art. 7 k.p.k.</w:t>
+      </w:r>
+    </w:p>
+    <w:p>
+      <w:pPr>
+        <w:spacing w:after="0" w:before="0" w:line="240" w:lineRule="auto"/>
+      </w:pPr>
+      <w:r>
+        <w:rPr>
+          <w:rFonts w:ascii="Times New Roman" w:hAnsi="Times New Roman"/>
+          <w:sz w:val="24"/>
+        </w:rPr>
+        <w:t xml:space="preserve">   Swobodna ocena dowodów – organ ocenia dowody według własnego przekonania, z uwzględnieniem zasad prawidłowego rozumowania.</w:t>
+      </w:r>
+    </w:p>
+    <w:p>
+      <w:pPr>
+        <w:spacing w:after="0" w:before="0" w:line="240" w:lineRule="auto"/>
+      </w:pPr>
+      <w:r>
+        <w:rPr>
+          <w:rFonts w:ascii="Times New Roman" w:hAnsi="Times New Roman"/>
+          <w:sz w:val="24"/>
+        </w:rPr>
+        <w:t>3. art. 17 § 1 pkt 2 k.p.k.</w:t>
+      </w:r>
+    </w:p>
+    <w:p>
+      <w:pPr>
+        <w:spacing w:after="0" w:before="0" w:line="240" w:lineRule="auto"/>
+      </w:pPr>
+      <w:r>
+        <w:rPr>
+          <w:rFonts w:ascii="Times New Roman" w:hAnsi="Times New Roman"/>
+          <w:sz w:val="24"/>
+        </w:rPr>
+        <w:t xml:space="preserve">   Nie wszczyna się postępowania, a wszczęte umarza, gdy czyn nie zawiera znamion czynu zabronionego.</w:t>
+      </w:r>
+    </w:p>
+    <w:p>
+      <w:pPr>
+        <w:spacing w:after="0" w:before="0" w:line="240" w:lineRule="auto"/>
+      </w:pPr>
+      <w:r>
+        <w:rPr>
+          <w:rFonts w:ascii="Times New Roman" w:hAnsi="Times New Roman"/>
+          <w:sz w:val="24"/>
+        </w:rPr>
+        <w:t>4. art. 410 k.p.k.</w:t>
       </w:r>
     </w:p>
     <w:p>
@@ -1709,78 +1781,6 @@
       <w:pPr>
         <w:spacing w:after="0" w:before="0" w:line="240" w:lineRule="auto"/>
       </w:pPr>
-      <w:r>
-        <w:rPr>
-          <w:rFonts w:ascii="Times New Roman" w:hAnsi="Times New Roman"/>
-          <w:sz w:val="24"/>
-        </w:rPr>
-        <w:t>2. art. 284 § 2 k.k.</w:t>
-      </w:r>
-    </w:p>
-    <w:p>
-      <w:pPr>
-        <w:spacing w:after="0" w:before="0" w:line="240" w:lineRule="auto"/>
-      </w:pPr>
-      <w:r>
-        <w:rPr>
-          <w:rFonts w:ascii="Times New Roman" w:hAnsi="Times New Roman"/>
-          <w:sz w:val="24"/>
-        </w:rPr>
-        <w:t xml:space="preserve">   Przywłaszczenie rzeczy powierzonej. Wymaga m.in. powierzenia z obowiązkiem zwrotu oraz zamiaru bezpośredniego przywłaszczenia.</w:t>
-      </w:r>
-    </w:p>
-    <w:p>
-      <w:pPr>
-        <w:spacing w:after="0" w:before="0" w:line="240" w:lineRule="auto"/>
-      </w:pPr>
-      <w:r>
-        <w:rPr>
-          <w:rFonts w:ascii="Times New Roman" w:hAnsi="Times New Roman"/>
-          <w:sz w:val="24"/>
-        </w:rPr>
-        <w:t>3. art. 17 § 1 pkt 2 k.p.k.</w:t>
-      </w:r>
-    </w:p>
-    <w:p>
-      <w:pPr>
-        <w:spacing w:after="0" w:before="0" w:line="240" w:lineRule="auto"/>
-      </w:pPr>
-      <w:r>
-        <w:rPr>
-          <w:rFonts w:ascii="Times New Roman" w:hAnsi="Times New Roman"/>
-          <w:sz w:val="24"/>
-        </w:rPr>
-        <w:t xml:space="preserve">   Nie wszczyna się postępowania, a wszczęte umarza, gdy czyn nie zawiera znamion czynu zabronionego.</w:t>
-      </w:r>
-    </w:p>
-    <w:p>
-      <w:pPr>
-        <w:spacing w:after="0" w:before="0" w:line="240" w:lineRule="auto"/>
-      </w:pPr>
-      <w:r>
-        <w:rPr>
-          <w:rFonts w:ascii="Times New Roman" w:hAnsi="Times New Roman"/>
-          <w:sz w:val="24"/>
-        </w:rPr>
-        <w:t>4. art. 7 k.p.k.</w:t>
-      </w:r>
-    </w:p>
-    <w:p>
-      <w:pPr>
-        <w:spacing w:after="0" w:before="0" w:line="240" w:lineRule="auto"/>
-      </w:pPr>
-      <w:r>
-        <w:rPr>
-          <w:rFonts w:ascii="Times New Roman" w:hAnsi="Times New Roman"/>
-          <w:sz w:val="24"/>
-        </w:rPr>
-        <w:t xml:space="preserve">   Swobodna ocena dowodów – organ ocenia dowody według własnego przekonania, z uwzględnieniem zasad prawidłowego rozumowania.</w:t>
-      </w:r>
-    </w:p>
-    <w:p>
-      <w:pPr>
-        <w:spacing w:after="0" w:before="0" w:line="240" w:lineRule="auto"/>
-      </w:pPr>
     </w:p>
     <w:p>
       <w:pPr>
@@ -1803,7 +1803,55 @@
           <w:rFonts w:ascii="Times New Roman" w:hAnsi="Times New Roman"/>
           <w:sz w:val="24"/>
         </w:rPr>
-        <w:t>1. V KK 391/14</w:t>
+        <w:t>1. IV KK 283/16</w:t>
+      </w:r>
+    </w:p>
+    <w:p>
+      <w:pPr>
+        <w:spacing w:after="0" w:before="0" w:line="240" w:lineRule="auto"/>
+      </w:pPr>
+      <w:r>
+        <w:rPr>
+          <w:rFonts w:ascii="Times New Roman" w:hAnsi="Times New Roman"/>
+          <w:sz w:val="24"/>
+        </w:rPr>
+        <w:t xml:space="preserve">   Teza: Odpowiedzialność z art. 284 § 2 k.k. dotyczy rzeczy powierzonej i wymaga ustalenia stosunku powierzenia oraz zamiaru bezpośredniego przywłaszczenia.</w:t>
+      </w:r>
+    </w:p>
+    <w:p>
+      <w:pPr>
+        <w:spacing w:after="0" w:before="0" w:line="240" w:lineRule="auto"/>
+      </w:pPr>
+      <w:r>
+        <w:rPr>
+          <w:rFonts w:ascii="Times New Roman" w:hAnsi="Times New Roman"/>
+          <w:sz w:val="24"/>
+        </w:rPr>
+        <w:t>2. II KK 8/15</w:t>
+      </w:r>
+    </w:p>
+    <w:p>
+      <w:pPr>
+        <w:spacing w:after="0" w:before="0" w:line="240" w:lineRule="auto"/>
+      </w:pPr>
+      <w:r>
+        <w:rPr>
+          <w:rFonts w:ascii="Times New Roman" w:hAnsi="Times New Roman"/>
+          <w:sz w:val="24"/>
+        </w:rPr>
+        <w:t xml:space="preserve">   Teza: Swobodna ocena dowodów nie jest oceną dowolną; wymaga oparcia na całokształcie dowodów i zasadach prawidłowego rozumowania.</w:t>
+      </w:r>
+    </w:p>
+    <w:p>
+      <w:pPr>
+        <w:spacing w:after="0" w:before="0" w:line="240" w:lineRule="auto"/>
+      </w:pPr>
+      <w:r>
+        <w:rPr>
+          <w:rFonts w:ascii="Times New Roman" w:hAnsi="Times New Roman"/>
+          <w:sz w:val="24"/>
+        </w:rPr>
+        <w:t>3. V KK 391/14</w:t>
       </w:r>
     </w:p>
     <w:p>
@@ -1827,7 +1875,7 @@
           <w:rFonts w:ascii="Times New Roman" w:hAnsi="Times New Roman"/>
           <w:sz w:val="24"/>
         </w:rPr>
-        <w:t>2. V KK 491/17</w:t>
+        <w:t>4. V KK 491/17</w:t>
       </w:r>
     </w:p>
     <w:p>
@@ -1846,54 +1894,6 @@
       <w:pPr>
         <w:spacing w:after="0" w:before="0" w:line="240" w:lineRule="auto"/>
       </w:pPr>
-      <w:r>
-        <w:rPr>
-          <w:rFonts w:ascii="Times New Roman" w:hAnsi="Times New Roman"/>
-          <w:sz w:val="24"/>
-        </w:rPr>
-        <w:t>3. IV KK 283/16</w:t>
-      </w:r>
-    </w:p>
-    <w:p>
-      <w:pPr>
-        <w:spacing w:after="0" w:before="0" w:line="240" w:lineRule="auto"/>
-      </w:pPr>
-      <w:r>
-        <w:rPr>
-          <w:rFonts w:ascii="Times New Roman" w:hAnsi="Times New Roman"/>
-          <w:sz w:val="24"/>
-        </w:rPr>
-        <w:t xml:space="preserve">   Teza: Odpowiedzialność z art. 284 § 2 k.k. dotyczy rzeczy powierzonej i wymaga ustalenia stosunku powierzenia oraz zamiaru bezpośredniego przywłaszczenia.</w:t>
-      </w:r>
-    </w:p>
-    <w:p>
-      <w:pPr>
-        <w:spacing w:after="0" w:before="0" w:line="240" w:lineRule="auto"/>
-      </w:pPr>
-      <w:r>
-        <w:rPr>
-          <w:rFonts w:ascii="Times New Roman" w:hAnsi="Times New Roman"/>
-          <w:sz w:val="24"/>
-        </w:rPr>
-        <w:t>4. II KK 8/15</w:t>
-      </w:r>
-    </w:p>
-    <w:p>
-      <w:pPr>
-        <w:spacing w:after="0" w:before="0" w:line="240" w:lineRule="auto"/>
-      </w:pPr>
-      <w:r>
-        <w:rPr>
-          <w:rFonts w:ascii="Times New Roman" w:hAnsi="Times New Roman"/>
-          <w:sz w:val="24"/>
-        </w:rPr>
-        <w:t xml:space="preserve">   Teza: Swobodna ocena dowodów nie jest oceną dowolną; wymaga oparcia na całokształcie dowodów i zasadach prawidłowego rozumowania.</w:t>
-      </w:r>
-    </w:p>
-    <w:p>
-      <w:pPr>
-        <w:spacing w:after="0" w:before="0" w:line="240" w:lineRule="auto"/>
-      </w:pPr>
     </w:p>
     <w:p>
       <w:pPr>
@@ -1916,7 +1916,7 @@
           <w:rFonts w:ascii="Times New Roman" w:hAnsi="Times New Roman"/>
           <w:sz w:val="24"/>
         </w:rPr>
-        <w:t>— SN V KK 391/14: Powierzenie rzeczy polega na przekazaniu sprawcy władztwa nad rzeczą z obowiązkiem jej zwrotu.</w:t>
+        <w:t>— SN IV KK 283/16: Odpowiedzialność z art. 284 § 2 k.k. dotyczy rzeczy powierzonej i wymaga ustalenia stosunku powierzenia oraz zamiaru bezpośredniego przywłaszczenia.</w:t>
       </w:r>
     </w:p>
     <w:p>
@@ -1928,7 +1928,7 @@
           <w:rFonts w:ascii="Times New Roman" w:hAnsi="Times New Roman"/>
           <w:sz w:val="24"/>
         </w:rPr>
-        <w:t>— SN IV KK 283/16: Odpowiedzialność z art. 284 § 2 k.k. dotyczy rzeczy powierzonej i wymaga ustalenia stosunku powierzenia oraz zamiaru bezpośredniego przywłaszczenia.</w:t>
+        <w:t>— SN V KK 391/14: Powierzenie rzeczy polega na przekazaniu sprawcy władztwa nad rzeczą z obowiązkiem jej zwrotu.</w:t>
       </w:r>
     </w:p>
     <w:p>

</xml_diff>